<commit_message>
Manuscript to BMC Health Services Research's research-article format
Abstract in BMC's sections (350 words), Background, an LLM-use subsection in Methods, Conclusions as its own
section, List of abbreviations and Declarations; STROBE checklist and eTables as Additional files 1 and 2 (numbered
by first citation); BioMed Central reference style with URLs and access dates for every web source; Word file with
line and page numbers (reference-bmc.docx); Table 2 title within 15 words; scripts/validate_bmc_compliance.py and
its tests. The i-JMR version is frozen at v1.2.0.

Co-Authored-By: Claude Opus 5.5 <noreply@anthropic.com>
</commit_message>
<xml_diff>
--- a/strobe.docx
+++ b/strobe.docx
@@ -7,7 +7,7 @@
         <w:pStyle w:val="Title"/>
       </w:pPr>
       <w:r>
-        <w:t xml:space="preserve">Multimedia Appendix 2. STROBE checklist. Early Renewal of Accountable Care Organization Agreements to Reset Benchmarks in the Medicare Shared Savings Program: Preregistered Retrospective Cohort Study</w:t>
+        <w:t xml:space="preserve">Additional file 1. STROBE checklist. Early renewal of accountable care organization agreements to reset benchmarks in the Medicare Shared Savings Program: a preregistered retrospective cohort study</w:t>
       </w:r>
     </w:p>
     <w:p>
@@ -51,7 +51,7 @@
         <w:t xml:space="preserve"> </w:t>
       </w:r>
       <w:r>
-        <w:t xml:space="preserve">with the place each is reported in the manuscript or in Multimedia Appendix 1 (eTables and eMethods).</w:t>
+        <w:t xml:space="preserve">with the place each is reported in the manuscript or in Additional file 2 (eTables and eMethods).</w:t>
       </w:r>
     </w:p>
     <w:p>
@@ -224,7 +224,7 @@
               <w:jc w:val="left"/>
             </w:pPr>
             <w:r>
-              <w:t xml:space="preserve">Introduction, paragraphs 1-4</w:t>
+              <w:t xml:space="preserve">Background, paragraphs 1-4</w:t>
             </w:r>
           </w:p>
         </w:tc>
@@ -274,7 +274,7 @@
               <w:jc w:val="left"/>
             </w:pPr>
             <w:r>
-              <w:t xml:space="preserve">Introduction, paragraph 5; Methods, Hypotheses</w:t>
+              <w:t xml:space="preserve">Background, paragraph 5; Methods, Hypotheses</w:t>
             </w:r>
           </w:p>
         </w:tc>
@@ -1706,38 +1706,22 @@
         <w:pStyle w:val="Bibliography"/>
       </w:pPr>
       <w:r>
-        <w:t xml:space="preserve">1.</w:t>
+        <w:t xml:space="preserve">1. von Elm E, Altman DG, Egger M, Pocock SJ, Gøtzsche PC, Vandenbroucke JP, et al. The Strengthening the Reporting of Observational Studies in Epidemiology (STROBE) Statement: Guidelines for Reporting Observational Studies. PLoS Medicine. 2007;4:e296.</w:t>
       </w:r>
       <w:r>
         <w:t xml:space="preserve"> </w:t>
-      </w:r>
-      <w:r>
-        <w:t xml:space="preserve">	</w:t>
-      </w:r>
-      <w:r>
-        <w:t xml:space="preserve">von Elm E, Altman DG, Egger M, et al. The Strengthening the Reporting of Observational Studies in Epidemiology (STROBE) Statement: Guidelines for Reporting Observational Studies.</w:t>
-      </w:r>
-      <w:r>
-        <w:t xml:space="preserve"> </w:t>
-      </w:r>
-      <w:r>
-        <w:rPr>
-          <w:i/>
-          <w:iCs/>
-        </w:rPr>
-        <w:t xml:space="preserve">PLoS Medicine</w:t>
-      </w:r>
-      <w:r>
-        <w:t xml:space="preserve">. 2007;4(10):e296. doi:</w:t>
       </w:r>
       <w:hyperlink r:id="rId9">
         <w:r>
           <w:rPr>
             <w:rStyle w:val="Hyperlink"/>
           </w:rPr>
-          <w:t xml:space="preserve">10.1371/journal.pmed.0040296</w:t>
+          <w:t xml:space="preserve">https://doi.org/10.1371/journal.pmed.0040296</w:t>
         </w:r>
       </w:hyperlink>
+      <w:r>
+        <w:t xml:space="preserve">.</w:t>
+      </w:r>
     </w:p>
     <w:bookmarkEnd w:id="10"/>
     <w:bookmarkEnd w:id="11"/>

</xml_diff>